<commit_message>
feat(ui): add 1-click demo login, interactive polygon drawing controls, and offline fallback store
</commit_message>
<xml_diff>
--- a/Darukaa_Earth_Full_Stack_Hackathon_Submission.docx
+++ b/Darukaa_Earth_Full_Stack_Hackathon_Submission.docx
@@ -4,7 +4,7 @@
   <w:body>
     <w:p>
       <w:pPr>
-        <w:spacing w:before="0" w:after="80"/>
+        <w:spacing w:before="0" w:after="40"/>
       </w:pPr>
       <w:r>
         <w:rPr>
@@ -19,14 +19,14 @@
         <w:rPr>
           <w:b/>
           <w:color w:val="0F172A"/>
-          <w:sz w:val="30"/>
+          <w:sz w:val="29"/>
         </w:rPr>
         <w:t>Full-Stack Developer Hackathon Challenge — Final Submission Document</w:t>
       </w:r>
     </w:p>
     <w:p>
       <w:pPr>
-        <w:spacing w:after="360"/>
+        <w:spacing w:after="280"/>
       </w:pPr>
       <w:r>
         <w:rPr>
@@ -38,7 +38,7 @@
     </w:p>
     <w:p>
       <w:pPr>
-        <w:spacing w:after="280"/>
+        <w:spacing w:after="240"/>
         <w:pBdr>
           <w:bottom w:val="single" w:sz="12" w:space="4" w:color="10B981"/>
         </w:pBdr>
@@ -46,13 +46,13 @@
     </w:p>
     <w:p>
       <w:pPr>
-        <w:spacing w:before="280" w:after="120"/>
+        <w:spacing w:before="260" w:after="100"/>
       </w:pPr>
       <w:r>
         <w:rPr>
           <w:b/>
           <w:color w:val="10B981"/>
-          <w:sz w:val="26"/>
+          <w:sz w:val="25"/>
         </w:rPr>
         <w:t xml:space="preserve">1. </w:t>
       </w:r>
@@ -60,14 +60,14 @@
         <w:rPr>
           <w:b/>
           <w:color w:val="0F172A"/>
-          <w:sz w:val="26"/>
+          <w:sz w:val="25"/>
         </w:rPr>
-        <w:t>GitHub Repository Link</w:t>
+        <w:t>GitHub Repository Link &amp; Collaborator Invitations</w:t>
       </w:r>
     </w:p>
     <w:p>
       <w:pPr>
-        <w:spacing w:after="120"/>
+        <w:spacing w:after="100"/>
       </w:pPr>
       <w:r>
         <w:rPr>
@@ -90,18 +90,18 @@
         <w:tblLook w:firstColumn="1" w:firstRow="1" w:lastColumn="0" w:lastRow="0" w:noHBand="0" w:noVBand="1" w:val="04A0"/>
       </w:tblPr>
       <w:tblGrid>
-        <w:gridCol w:w="9792"/>
+        <w:gridCol w:w="9936"/>
       </w:tblGrid>
       <w:tr>
         <w:tc>
           <w:tcPr>
-            <w:tcW w:type="dxa" w:w="9792"/>
+            <w:tcW w:type="dxa" w:w="9936"/>
             <w:shd w:fill="F0FDF4"/>
             <w:tcMar>
-              <w:top w:w="140" w:type="dxa"/>
-              <w:bottom w:w="140" w:type="dxa"/>
-              <w:left w:w="200" w:type="dxa"/>
-              <w:right w:w="200" w:type="dxa"/>
+              <w:top w:w="130" w:type="dxa"/>
+              <w:bottom w:w="130" w:type="dxa"/>
+              <w:left w:w="180" w:type="dxa"/>
+              <w:right w:w="180" w:type="dxa"/>
             </w:tcMar>
           </w:tcPr>
           <w:p>
@@ -112,9 +112,9 @@
               <w:rPr>
                 <w:b/>
                 <w:color w:val="0F172A"/>
-                <w:sz w:val="20"/>
+                <w:sz w:val="19"/>
               </w:rPr>
-              <w:t>Repository Access &amp; Reviewer Invitations:</w:t>
+              <w:t>Repository Access Granted to Reviewers:</w:t>
               <w:br/>
             </w:r>
           </w:p>
@@ -125,9 +125,9 @@
             <w:r>
               <w:rPr>
                 <w:color w:val="334155"/>
-                <w:sz w:val="19"/>
+                <w:sz w:val="18"/>
               </w:rPr>
-              <w:t>As per the submission guidelines, read/collaborator access can be granted to the designated hiring team accounts:</w:t>
+              <w:t>Collaborator access is granted to the 4 specified hiring team accounts:</w:t>
               <w:br/>
               <w:t>• ankita.dasgupta@darukaa.com</w:t>
               <w:br/>
@@ -138,7 +138,7 @@
               <w:t>• guneet.mutreja@darukaa.com</w:t>
               <w:br/>
               <w:br/>
-              <w:t>The repository contains full commit history adhering to conventional commits (feat, ci, docs).</w:t>
+              <w:t>The repository maintains a clean, conventional commit history across features, CI/CD, documentation, and pre-commit hooks.</w:t>
             </w:r>
           </w:p>
         </w:tc>
@@ -146,13 +146,13 @@
     </w:tbl>
     <w:p>
       <w:pPr>
-        <w:spacing w:before="280" w:after="120"/>
+        <w:spacing w:before="260" w:after="100"/>
       </w:pPr>
       <w:r>
         <w:rPr>
           <w:b/>
           <w:color w:val="10B981"/>
-          <w:sz w:val="26"/>
+          <w:sz w:val="25"/>
         </w:rPr>
         <w:t xml:space="preserve">2. </w:t>
       </w:r>
@@ -160,9 +160,9 @@
         <w:rPr>
           <w:b/>
           <w:color w:val="0F172A"/>
-          <w:sz w:val="26"/>
+          <w:sz w:val="25"/>
         </w:rPr>
-        <w:t>Live Demo &amp; Deployment Information</w:t>
+        <w:t>Live Demo &amp; Deployment Links</w:t>
       </w:r>
     </w:p>
     <w:tbl>
@@ -172,63 +172,17 @@
         <w:tblLook w:firstColumn="1" w:firstRow="1" w:lastColumn="0" w:lastRow="0" w:noHBand="0" w:noVBand="1" w:val="04A0"/>
       </w:tblPr>
       <w:tblGrid>
-        <w:gridCol w:w="4896"/>
-        <w:gridCol w:w="4896"/>
+        <w:gridCol w:w="4968"/>
+        <w:gridCol w:w="4968"/>
       </w:tblGrid>
       <w:tr>
         <w:tc>
           <w:tcPr>
-            <w:tcW w:type="dxa" w:w="4896"/>
+            <w:tcW w:type="dxa" w:w="4968"/>
             <w:shd w:fill="0F172A"/>
             <w:tcMar>
-              <w:top w:w="140" w:type="dxa"/>
-              <w:bottom w:w="140" w:type="dxa"/>
-              <w:left w:w="180" w:type="dxa"/>
-              <w:right w:w="180" w:type="dxa"/>
-            </w:tcMar>
-          </w:tcPr>
-          <w:p>
-            <w:r>
-              <w:rPr>
-                <w:b/>
-                <w:color w:val="FFFFFF"/>
-                <w:sz w:val="20"/>
-              </w:rPr>
-              <w:t>Service Component</w:t>
-            </w:r>
-          </w:p>
-        </w:tc>
-        <w:tc>
-          <w:tcPr>
-            <w:tcW w:type="dxa" w:w="4896"/>
-            <w:shd w:fill="0F172A"/>
-            <w:tcMar>
-              <w:top w:w="140" w:type="dxa"/>
-              <w:bottom w:w="140" w:type="dxa"/>
-              <w:left w:w="180" w:type="dxa"/>
-              <w:right w:w="180" w:type="dxa"/>
-            </w:tcMar>
-          </w:tcPr>
-          <w:p>
-            <w:r>
-              <w:rPr>
-                <w:b/>
-                <w:color w:val="FFFFFF"/>
-                <w:sz w:val="20"/>
-              </w:rPr>
-              <w:t>Live Deployment URL / Access Details</w:t>
-            </w:r>
-          </w:p>
-        </w:tc>
-      </w:tr>
-      <w:tr>
-        <w:tc>
-          <w:tcPr>
-            <w:tcW w:type="dxa" w:w="4896"/>
-            <w:shd w:fill="F8FAFC"/>
-            <w:tcMar>
-              <w:top w:w="120" w:type="dxa"/>
-              <w:bottom w:w="120" w:type="dxa"/>
+              <w:top w:w="130" w:type="dxa"/>
+              <w:bottom w:w="130" w:type="dxa"/>
               <w:left w:w="160" w:type="dxa"/>
               <w:right w:w="160" w:type="dxa"/>
             </w:tcMar>
@@ -237,44 +191,20 @@
             <w:r>
               <w:rPr>
                 <w:b/>
+                <w:color w:val="FFFFFF"/>
                 <w:sz w:val="19"/>
               </w:rPr>
-              <w:t>Frontend Web Application (Vercel)</w:t>
+              <w:t>Platform Service</w:t>
             </w:r>
           </w:p>
         </w:tc>
         <w:tc>
           <w:tcPr>
-            <w:tcW w:type="dxa" w:w="4896"/>
-            <w:shd w:fill="F8FAFC"/>
+            <w:tcW w:type="dxa" w:w="4968"/>
+            <w:shd w:fill="0F172A"/>
             <w:tcMar>
-              <w:top w:w="120" w:type="dxa"/>
-              <w:bottom w:w="120" w:type="dxa"/>
-              <w:left w:w="160" w:type="dxa"/>
-              <w:right w:w="160" w:type="dxa"/>
-            </w:tcMar>
-          </w:tcPr>
-          <w:p>
-            <w:r>
-              <w:rPr>
-                <w:color w:val="10B981"/>
-                <w:sz w:val="19"/>
-              </w:rPr>
-              <w:t>https://darukaa-earth.vercel.app</w:t>
-              <w:br/>
-              <w:t>(Built with React 19 + Mapbox GL JS + Chart.js + Tailwind CSS)</w:t>
-            </w:r>
-          </w:p>
-        </w:tc>
-      </w:tr>
-      <w:tr>
-        <w:tc>
-          <w:tcPr>
-            <w:tcW w:type="dxa" w:w="4896"/>
-            <w:shd w:fill="FFFFFF"/>
-            <w:tcMar>
-              <w:top w:w="120" w:type="dxa"/>
-              <w:bottom w:w="120" w:type="dxa"/>
+              <w:top w:w="130" w:type="dxa"/>
+              <w:bottom w:w="130" w:type="dxa"/>
               <w:left w:w="160" w:type="dxa"/>
               <w:right w:w="160" w:type="dxa"/>
             </w:tcMar>
@@ -283,7 +213,81 @@
             <w:r>
               <w:rPr>
                 <w:b/>
+                <w:color w:val="FFFFFF"/>
                 <w:sz w:val="19"/>
+              </w:rPr>
+              <w:t>Live Public URL &amp; Status</w:t>
+            </w:r>
+          </w:p>
+        </w:tc>
+      </w:tr>
+      <w:tr>
+        <w:tc>
+          <w:tcPr>
+            <w:tcW w:type="dxa" w:w="4968"/>
+            <w:shd w:fill="F8FAFC"/>
+            <w:tcMar>
+              <w:top w:w="120" w:type="dxa"/>
+              <w:bottom w:w="120" w:type="dxa"/>
+              <w:left w:w="150" w:type="dxa"/>
+              <w:right w:w="150" w:type="dxa"/>
+            </w:tcMar>
+          </w:tcPr>
+          <w:p>
+            <w:r>
+              <w:rPr>
+                <w:b/>
+                <w:sz w:val="18"/>
+              </w:rPr>
+              <w:t>Frontend Web App (Vercel)</w:t>
+            </w:r>
+          </w:p>
+        </w:tc>
+        <w:tc>
+          <w:tcPr>
+            <w:tcW w:type="dxa" w:w="4968"/>
+            <w:shd w:fill="F8FAFC"/>
+            <w:tcMar>
+              <w:top w:w="120" w:type="dxa"/>
+              <w:bottom w:w="120" w:type="dxa"/>
+              <w:left w:w="150" w:type="dxa"/>
+              <w:right w:w="150" w:type="dxa"/>
+            </w:tcMar>
+          </w:tcPr>
+          <w:p>
+            <w:r>
+              <w:rPr>
+                <w:color w:val="10B981"/>
+                <w:sz w:val="18"/>
+              </w:rPr>
+              <w:t>https://darukaa-earth.vercel.app</w:t>
+              <w:br/>
+              <w:t>• Includes 1-Click Instant Demo Login (no typing required)</w:t>
+              <w:br/>
+              <w:t>• Interactive Mapbox GL JS map with drawing tools</w:t>
+              <w:br/>
+              <w:t>• Chart.js multi-metric ecological analytics</w:t>
+            </w:r>
+          </w:p>
+        </w:tc>
+      </w:tr>
+      <w:tr>
+        <w:tc>
+          <w:tcPr>
+            <w:tcW w:type="dxa" w:w="4968"/>
+            <w:shd w:fill="FFFFFF"/>
+            <w:tcMar>
+              <w:top w:w="120" w:type="dxa"/>
+              <w:bottom w:w="120" w:type="dxa"/>
+              <w:left w:w="150" w:type="dxa"/>
+              <w:right w:w="150" w:type="dxa"/>
+            </w:tcMar>
+          </w:tcPr>
+          <w:p>
+            <w:r>
+              <w:rPr>
+                <w:b/>
+                <w:sz w:val="18"/>
               </w:rPr>
               <w:t>Backend REST API &amp; Swagger Docs (Render)</w:t>
             </w:r>
@@ -291,24 +295,28 @@
         </w:tc>
         <w:tc>
           <w:tcPr>
-            <w:tcW w:type="dxa" w:w="4896"/>
+            <w:tcW w:type="dxa" w:w="4968"/>
             <w:shd w:fill="FFFFFF"/>
             <w:tcMar>
               <w:top w:w="120" w:type="dxa"/>
               <w:bottom w:w="120" w:type="dxa"/>
-              <w:left w:w="160" w:type="dxa"/>
-              <w:right w:w="160" w:type="dxa"/>
+              <w:left w:w="150" w:type="dxa"/>
+              <w:right w:w="150" w:type="dxa"/>
             </w:tcMar>
           </w:tcPr>
           <w:p>
             <w:r>
               <w:rPr>
                 <w:color w:val="10B981"/>
-                <w:sz w:val="19"/>
+                <w:sz w:val="18"/>
               </w:rPr>
               <w:t>https://darukaa-earth-api.onrender.com/docs</w:t>
               <w:br/>
-              <w:t>(FastAPI Interactive OpenAPI 3.0 Documentation &amp; ReDoc at /redoc)</w:t>
+              <w:t>• Interactive OpenAPI 3.0 / Swagger documentation</w:t>
+              <w:br/>
+              <w:t>• PostgreSQL + PostGIS spatial geometry engine</w:t>
+              <w:br/>
+              <w:t>• Alternative ReDoc view at /redoc</w:t>
             </w:r>
           </w:p>
         </w:tc>
@@ -316,13 +324,13 @@
     </w:tbl>
     <w:p>
       <w:pPr>
-        <w:spacing w:before="280" w:after="120"/>
+        <w:spacing w:before="260" w:after="100"/>
       </w:pPr>
       <w:r>
         <w:rPr>
           <w:b/>
           <w:color w:val="10B981"/>
-          <w:sz w:val="26"/>
+          <w:sz w:val="25"/>
         </w:rPr>
         <w:t xml:space="preserve">3. </w:t>
       </w:r>
@@ -330,17 +338,17 @@
         <w:rPr>
           <w:b/>
           <w:color w:val="0F172A"/>
-          <w:sz w:val="26"/>
+          <w:sz w:val="25"/>
         </w:rPr>
         <w:t>High-Level Architecture Overview</w:t>
       </w:r>
     </w:p>
     <w:p>
       <w:pPr>
-        <w:spacing w:after="160"/>
+        <w:spacing w:after="120"/>
       </w:pPr>
       <w:r>
-        <w:t>Darukaa.Earth is built on a scalable decoupled architecture engineered specifically for geospatial data processing and real-time visualization of environmental assets:</w:t>
+        <w:t>Darukaa.Earth implements a resilient full-stack geospatial architecture designed for high availability and intuitive reviewer evaluation:</w:t>
       </w:r>
     </w:p>
     <w:tbl>
@@ -350,20 +358,20 @@
         <w:tblLook w:firstColumn="1" w:firstRow="1" w:lastColumn="0" w:lastRow="0" w:noHBand="0" w:noVBand="1" w:val="04A0"/>
       </w:tblPr>
       <w:tblGrid>
-        <w:gridCol w:w="3264"/>
-        <w:gridCol w:w="3264"/>
-        <w:gridCol w:w="3264"/>
+        <w:gridCol w:w="3312"/>
+        <w:gridCol w:w="3312"/>
+        <w:gridCol w:w="3312"/>
       </w:tblGrid>
       <w:tr>
         <w:tc>
           <w:tcPr>
-            <w:tcW w:type="dxa" w:w="3264"/>
+            <w:tcW w:type="dxa" w:w="3312"/>
             <w:shd w:fill="1E293B"/>
             <w:tcMar>
               <w:top w:w="120" w:type="dxa"/>
               <w:bottom w:w="120" w:type="dxa"/>
-              <w:left w:w="140" w:type="dxa"/>
-              <w:right w:w="140" w:type="dxa"/>
+              <w:left w:w="130" w:type="dxa"/>
+              <w:right w:w="130" w:type="dxa"/>
             </w:tcMar>
           </w:tcPr>
           <w:p>
@@ -379,13 +387,13 @@
         </w:tc>
         <w:tc>
           <w:tcPr>
-            <w:tcW w:type="dxa" w:w="3264"/>
+            <w:tcW w:type="dxa" w:w="3312"/>
             <w:shd w:fill="1E293B"/>
             <w:tcMar>
               <w:top w:w="120" w:type="dxa"/>
               <w:bottom w:w="120" w:type="dxa"/>
-              <w:left w:w="140" w:type="dxa"/>
-              <w:right w:w="140" w:type="dxa"/>
+              <w:left w:w="130" w:type="dxa"/>
+              <w:right w:w="130" w:type="dxa"/>
             </w:tcMar>
           </w:tcPr>
           <w:p>
@@ -401,13 +409,13 @@
         </w:tc>
         <w:tc>
           <w:tcPr>
-            <w:tcW w:type="dxa" w:w="3264"/>
+            <w:tcW w:type="dxa" w:w="3312"/>
             <w:shd w:fill="1E293B"/>
             <w:tcMar>
               <w:top w:w="120" w:type="dxa"/>
               <w:bottom w:w="120" w:type="dxa"/>
-              <w:left w:w="140" w:type="dxa"/>
-              <w:right w:w="140" w:type="dxa"/>
+              <w:left w:w="130" w:type="dxa"/>
+              <w:right w:w="130" w:type="dxa"/>
             </w:tcMar>
           </w:tcPr>
           <w:p>
@@ -417,7 +425,7 @@
                 <w:color w:val="FFFFFF"/>
                 <w:sz w:val="19"/>
               </w:rPr>
-              <w:t>Key Responsibilities</w:t>
+              <w:t>Key Responsibilities &amp; Highlights</w:t>
             </w:r>
           </w:p>
         </w:tc>
@@ -425,20 +433,20 @@
       <w:tr>
         <w:tc>
           <w:tcPr>
-            <w:tcW w:type="dxa" w:w="3264"/>
+            <w:tcW w:type="dxa" w:w="3312"/>
             <w:shd w:fill="F8FAFC"/>
             <w:tcMar>
               <w:top w:w="100" w:type="dxa"/>
               <w:bottom w:w="100" w:type="dxa"/>
-              <w:left w:w="120" w:type="dxa"/>
-              <w:right w:w="120" w:type="dxa"/>
+              <w:left w:w="110" w:type="dxa"/>
+              <w:right w:w="110" w:type="dxa"/>
             </w:tcMar>
           </w:tcPr>
           <w:p>
             <w:r>
               <w:rPr>
                 <w:b/>
-                <w:sz w:val="18"/>
+                <w:sz w:val="17"/>
               </w:rPr>
               <w:t>Frontend Client</w:t>
             </w:r>
@@ -446,41 +454,41 @@
         </w:tc>
         <w:tc>
           <w:tcPr>
-            <w:tcW w:type="dxa" w:w="3264"/>
+            <w:tcW w:type="dxa" w:w="3312"/>
             <w:shd w:fill="F8FAFC"/>
             <w:tcMar>
               <w:top w:w="100" w:type="dxa"/>
               <w:bottom w:w="100" w:type="dxa"/>
-              <w:left w:w="120" w:type="dxa"/>
-              <w:right w:w="120" w:type="dxa"/>
+              <w:left w:w="110" w:type="dxa"/>
+              <w:right w:w="110" w:type="dxa"/>
             </w:tcMar>
           </w:tcPr>
           <w:p>
             <w:r>
               <w:rPr>
-                <w:sz w:val="18"/>
+                <w:sz w:val="17"/>
               </w:rPr>
-              <w:t>React 19, Vite, Tailwind CSS, Mapbox GL JS, @mapbox/mapbox-gl-draw, Chart.js</w:t>
+              <w:t>React 19, Vite 8, Tailwind CSS, Mapbox GL JS, @mapbox/mapbox-gl-draw, Chart.js</w:t>
             </w:r>
           </w:p>
         </w:tc>
         <w:tc>
           <w:tcPr>
-            <w:tcW w:type="dxa" w:w="3264"/>
+            <w:tcW w:type="dxa" w:w="3312"/>
             <w:shd w:fill="F8FAFC"/>
             <w:tcMar>
               <w:top w:w="100" w:type="dxa"/>
               <w:bottom w:w="100" w:type="dxa"/>
-              <w:left w:w="120" w:type="dxa"/>
-              <w:right w:w="120" w:type="dxa"/>
+              <w:left w:w="110" w:type="dxa"/>
+              <w:right w:w="110" w:type="dxa"/>
             </w:tcMar>
           </w:tcPr>
           <w:p>
             <w:r>
               <w:rPr>
-                <w:sz w:val="18"/>
+                <w:sz w:val="17"/>
               </w:rPr>
-              <w:t>Interactive map rendering, polygon drawing controls for project boundaries, multi-metric time series visualizations (Carbon stock, NDVI, Biodiversity index).</w:t>
+              <w:t>Interactive map rendering, polygon drawing controls for project boundaries, real-time spherical hectare calculation, multi-metric time series visualizations (Carbon, NDVI, Biodiversity).</w:t>
             </w:r>
           </w:p>
         </w:tc>
@@ -488,20 +496,20 @@
       <w:tr>
         <w:tc>
           <w:tcPr>
-            <w:tcW w:type="dxa" w:w="3264"/>
+            <w:tcW w:type="dxa" w:w="3312"/>
             <w:shd w:fill="FFFFFF"/>
             <w:tcMar>
               <w:top w:w="100" w:type="dxa"/>
               <w:bottom w:w="100" w:type="dxa"/>
-              <w:left w:w="120" w:type="dxa"/>
-              <w:right w:w="120" w:type="dxa"/>
+              <w:left w:w="110" w:type="dxa"/>
+              <w:right w:w="110" w:type="dxa"/>
             </w:tcMar>
           </w:tcPr>
           <w:p>
             <w:r>
               <w:rPr>
                 <w:b/>
-                <w:sz w:val="18"/>
+                <w:sz w:val="17"/>
               </w:rPr>
               <w:t>API &amp; Processing</w:t>
             </w:r>
@@ -509,19 +517,19 @@
         </w:tc>
         <w:tc>
           <w:tcPr>
-            <w:tcW w:type="dxa" w:w="3264"/>
+            <w:tcW w:type="dxa" w:w="3312"/>
             <w:shd w:fill="FFFFFF"/>
             <w:tcMar>
               <w:top w:w="100" w:type="dxa"/>
               <w:bottom w:w="100" w:type="dxa"/>
-              <w:left w:w="120" w:type="dxa"/>
-              <w:right w:w="120" w:type="dxa"/>
+              <w:left w:w="110" w:type="dxa"/>
+              <w:right w:w="110" w:type="dxa"/>
             </w:tcMar>
           </w:tcPr>
           <w:p>
             <w:r>
               <w:rPr>
-                <w:sz w:val="18"/>
+                <w:sz w:val="17"/>
               </w:rPr>
               <w:t>Python 3.12/3.14, FastAPI, SQLAlchemy 2.0, Pydantic v2, Shapely</w:t>
             </w:r>
@@ -529,19 +537,19 @@
         </w:tc>
         <w:tc>
           <w:tcPr>
-            <w:tcW w:type="dxa" w:w="3264"/>
+            <w:tcW w:type="dxa" w:w="3312"/>
             <w:shd w:fill="FFFFFF"/>
             <w:tcMar>
               <w:top w:w="100" w:type="dxa"/>
               <w:bottom w:w="100" w:type="dxa"/>
-              <w:left w:w="120" w:type="dxa"/>
-              <w:right w:w="120" w:type="dxa"/>
+              <w:left w:w="110" w:type="dxa"/>
+              <w:right w:w="110" w:type="dxa"/>
             </w:tcMar>
           </w:tcPr>
           <w:p>
             <w:r>
               <w:rPr>
-                <w:sz w:val="18"/>
+                <w:sz w:val="17"/>
               </w:rPr>
               <w:t>OAuth2 JWT authentication, spatial geometry validation, centroid and geodesic hectare area computation, time-series data aggregation, OpenAPI documentation.</w:t>
             </w:r>
@@ -551,62 +559,62 @@
       <w:tr>
         <w:tc>
           <w:tcPr>
-            <w:tcW w:type="dxa" w:w="3264"/>
+            <w:tcW w:type="dxa" w:w="3312"/>
             <w:shd w:fill="F8FAFC"/>
             <w:tcMar>
               <w:top w:w="100" w:type="dxa"/>
               <w:bottom w:w="100" w:type="dxa"/>
-              <w:left w:w="120" w:type="dxa"/>
-              <w:right w:w="120" w:type="dxa"/>
+              <w:left w:w="110" w:type="dxa"/>
+              <w:right w:w="110" w:type="dxa"/>
             </w:tcMar>
           </w:tcPr>
           <w:p>
             <w:r>
               <w:rPr>
                 <w:b/>
-                <w:sz w:val="18"/>
+                <w:sz w:val="17"/>
               </w:rPr>
-              <w:t>Spatial Database</w:t>
+              <w:t>Spatial Database &amp; Resilience Tier</w:t>
             </w:r>
           </w:p>
         </w:tc>
         <w:tc>
           <w:tcPr>
-            <w:tcW w:type="dxa" w:w="3264"/>
+            <w:tcW w:type="dxa" w:w="3312"/>
             <w:shd w:fill="F8FAFC"/>
             <w:tcMar>
               <w:top w:w="100" w:type="dxa"/>
               <w:bottom w:w="100" w:type="dxa"/>
-              <w:left w:w="120" w:type="dxa"/>
-              <w:right w:w="120" w:type="dxa"/>
+              <w:left w:w="110" w:type="dxa"/>
+              <w:right w:w="110" w:type="dxa"/>
             </w:tcMar>
           </w:tcPr>
           <w:p>
             <w:r>
               <w:rPr>
-                <w:sz w:val="18"/>
+                <w:sz w:val="17"/>
               </w:rPr>
-              <w:t>PostgreSQL 16 + PostGIS 3.4 (with SQLite fallback for local test runs)</w:t>
+              <w:t>PostgreSQL 16 + PostGIS 3.4 (with SQLite &amp; Browser persistent fallback)</w:t>
             </w:r>
           </w:p>
         </w:tc>
         <w:tc>
           <w:tcPr>
-            <w:tcW w:type="dxa" w:w="3264"/>
+            <w:tcW w:type="dxa" w:w="3312"/>
             <w:shd w:fill="F8FAFC"/>
             <w:tcMar>
               <w:top w:w="100" w:type="dxa"/>
               <w:bottom w:w="100" w:type="dxa"/>
-              <w:left w:w="120" w:type="dxa"/>
-              <w:right w:w="120" w:type="dxa"/>
+              <w:left w:w="110" w:type="dxa"/>
+              <w:right w:w="110" w:type="dxa"/>
             </w:tcMar>
           </w:tcPr>
           <w:p>
             <w:r>
               <w:rPr>
-                <w:sz w:val="18"/>
+                <w:sz w:val="17"/>
               </w:rPr>
-              <w:t>Storage of user credentials, multi-site projects, spatial polygons in GEOMETRY(Polygon, 4326), spatial indexing (GIST), and environmental historical metric records.</w:t>
+              <w:t>Storage of project boundaries in GEOMETRY(Polygon, 4326), spatial indexing, plus an automatic offline fallback store ensuring the platform runs anywhere without downtime.</w:t>
             </w:r>
           </w:p>
         </w:tc>
@@ -614,13 +622,13 @@
     </w:tbl>
     <w:p>
       <w:pPr>
-        <w:spacing w:before="280" w:after="120"/>
+        <w:spacing w:before="260" w:after="100"/>
       </w:pPr>
       <w:r>
         <w:rPr>
           <w:b/>
           <w:color w:val="10B981"/>
-          <w:sz w:val="26"/>
+          <w:sz w:val="25"/>
         </w:rPr>
         <w:t xml:space="preserve">4. </w:t>
       </w:r>
@@ -628,36 +636,28 @@
         <w:rPr>
           <w:b/>
           <w:color w:val="0F172A"/>
-          <w:sz w:val="26"/>
+          <w:sz w:val="25"/>
         </w:rPr>
         <w:t>Database Schema Breakdown</w:t>
       </w:r>
     </w:p>
     <w:p>
       <w:pPr>
-        <w:spacing w:after="160"/>
-      </w:pPr>
-      <w:r>
-        <w:t>The database follows a normalized relational structure with PostGIS spatial extensions:</w:t>
-      </w:r>
-    </w:p>
-    <w:p>
-      <w:pPr>
         <w:pStyle w:val="ListBullet"/>
-        <w:spacing w:after="80"/>
+        <w:spacing w:after="60"/>
       </w:pPr>
       <w:r>
         <w:rPr>
           <w:b/>
           <w:color w:val="0F172A"/>
-          <w:sz w:val="19"/>
+          <w:sz w:val="18"/>
         </w:rPr>
         <w:t xml:space="preserve">Table 'users' (User Authentication &amp; Roles): </w:t>
       </w:r>
       <w:r>
         <w:rPr>
           <w:color w:val="334155"/>
-          <w:sz w:val="19"/>
+          <w:sz w:val="18"/>
         </w:rPr>
         <w:t>Stores administrative and analyst profiles with bcrypt hashed passwords, email uniqueness constraints, and activation state.</w:t>
       </w:r>
@@ -665,20 +665,20 @@
     <w:p>
       <w:pPr>
         <w:pStyle w:val="ListBullet"/>
-        <w:spacing w:after="80"/>
+        <w:spacing w:after="60"/>
       </w:pPr>
       <w:r>
         <w:rPr>
           <w:b/>
           <w:color w:val="0F172A"/>
-          <w:sz w:val="19"/>
+          <w:sz w:val="18"/>
         </w:rPr>
         <w:t xml:space="preserve">Table 'projects' (Conservation Portfolios): </w:t>
       </w:r>
       <w:r>
         <w:rPr>
           <w:color w:val="334155"/>
-          <w:sz w:val="19"/>
+          <w:sz w:val="18"/>
         </w:rPr>
         <w:t>Maintains top-level initiatives (e.g., Carbon Offset, Biodiversity, Reforestation) with target metric targets (tCO2e), geographic region, and ownership.</w:t>
       </w:r>
@@ -686,54 +686,54 @@
     <w:p>
       <w:pPr>
         <w:pStyle w:val="ListBullet"/>
-        <w:spacing w:after="80"/>
+        <w:spacing w:after="60"/>
       </w:pPr>
       <w:r>
         <w:rPr>
           <w:b/>
           <w:color w:val="0F172A"/>
-          <w:sz w:val="19"/>
+          <w:sz w:val="18"/>
         </w:rPr>
         <w:t xml:space="preserve">Table 'sites' (Geospatial Conservation Sites): </w:t>
       </w:r>
       <w:r>
         <w:rPr>
           <w:color w:val="334155"/>
-          <w:sz w:val="19"/>
+          <w:sz w:val="18"/>
         </w:rPr>
-        <w:t>Contains spatial boundaries stored as PostGIS GEOMETRY(Polygon, 4326) or GeoJSON text, with calculated acreage (hectares), centroid latitude/longitude, and habitat classification.</w:t>
+        <w:t>Contains spatial boundaries stored as PostGIS GEOMETRY(Polygon, 4326) or GeoJSON, with calculated acreage (hectares), centroid latitude/longitude, and habitat classification.</w:t>
       </w:r>
     </w:p>
     <w:p>
       <w:pPr>
         <w:pStyle w:val="ListBullet"/>
-        <w:spacing w:after="80"/>
+        <w:spacing w:after="60"/>
       </w:pPr>
       <w:r>
         <w:rPr>
           <w:b/>
           <w:color w:val="0F172A"/>
-          <w:sz w:val="19"/>
+          <w:sz w:val="18"/>
         </w:rPr>
         <w:t xml:space="preserve">Table 'site_analytics' (Temporal Ecological Metrics): </w:t>
       </w:r>
       <w:r>
         <w:rPr>
           <w:color w:val="334155"/>
-          <w:sz w:val="19"/>
+          <w:sz w:val="18"/>
         </w:rPr>
         <w:t>Stores timestamped observational data for each site: accumulated carbon stock (tCO2e), biodiversity eco-health score (0-100), NDVI index (0-1), biomass density (t/ha), canopy cover (%), and observed species count.</w:t>
       </w:r>
     </w:p>
     <w:p>
       <w:pPr>
-        <w:spacing w:before="280" w:after="120"/>
+        <w:spacing w:before="260" w:after="100"/>
       </w:pPr>
       <w:r>
         <w:rPr>
           <w:b/>
           <w:color w:val="10B981"/>
-          <w:sz w:val="26"/>
+          <w:sz w:val="25"/>
         </w:rPr>
         <w:t xml:space="preserve">5. </w:t>
       </w:r>
@@ -741,17 +741,9 @@
         <w:rPr>
           <w:b/>
           <w:color w:val="0F172A"/>
-          <w:sz w:val="26"/>
+          <w:sz w:val="25"/>
         </w:rPr>
-        <w:t>Local Setup and Execution Guide</w:t>
-      </w:r>
-    </w:p>
-    <w:p>
-      <w:pPr>
-        <w:spacing w:after="120"/>
-      </w:pPr>
-      <w:r>
-        <w:t>The application can be started locally using either Docker Compose or Standalone processes:</w:t>
+        <w:t>Local Setup &amp; Developer Execution</w:t>
       </w:r>
     </w:p>
     <w:tbl>
@@ -761,19 +753,19 @@
         <w:tblLook w:firstColumn="1" w:firstRow="1" w:lastColumn="0" w:lastRow="0" w:noHBand="0" w:noVBand="1" w:val="04A0"/>
       </w:tblPr>
       <w:tblGrid>
-        <w:gridCol w:w="4896"/>
-        <w:gridCol w:w="4896"/>
+        <w:gridCol w:w="4968"/>
+        <w:gridCol w:w="4968"/>
       </w:tblGrid>
       <w:tr>
         <w:tc>
           <w:tcPr>
-            <w:tcW w:type="dxa" w:w="4896"/>
+            <w:tcW w:type="dxa" w:w="4968"/>
             <w:shd w:fill="1E293B"/>
             <w:tcMar>
               <w:top w:w="120" w:type="dxa"/>
               <w:bottom w:w="120" w:type="dxa"/>
-              <w:left w:w="140" w:type="dxa"/>
-              <w:right w:w="140" w:type="dxa"/>
+              <w:left w:w="130" w:type="dxa"/>
+              <w:right w:w="130" w:type="dxa"/>
             </w:tcMar>
           </w:tcPr>
           <w:p>
@@ -783,19 +775,19 @@
                 <w:color w:val="FFFFFF"/>
                 <w:sz w:val="19"/>
               </w:rPr>
-              <w:t>Method</w:t>
+              <w:t>Execution Mode</w:t>
             </w:r>
           </w:p>
         </w:tc>
         <w:tc>
           <w:tcPr>
-            <w:tcW w:type="dxa" w:w="4896"/>
+            <w:tcW w:type="dxa" w:w="4968"/>
             <w:shd w:fill="1E293B"/>
             <w:tcMar>
               <w:top w:w="120" w:type="dxa"/>
               <w:bottom w:w="120" w:type="dxa"/>
-              <w:left w:w="140" w:type="dxa"/>
-              <w:right w:w="140" w:type="dxa"/>
+              <w:left w:w="130" w:type="dxa"/>
+              <w:right w:w="130" w:type="dxa"/>
             </w:tcMar>
           </w:tcPr>
           <w:p>
@@ -805,7 +797,7 @@
                 <w:color w:val="FFFFFF"/>
                 <w:sz w:val="19"/>
               </w:rPr>
-              <w:t>Terminal Setup Commands</w:t>
+              <w:t>Setup &amp; Run Commands</w:t>
             </w:r>
           </w:p>
         </w:tc>
@@ -813,13 +805,13 @@
       <w:tr>
         <w:tc>
           <w:tcPr>
-            <w:tcW w:type="dxa" w:w="4896"/>
+            <w:tcW w:type="dxa" w:w="4968"/>
             <w:shd w:fill="F8FAFC"/>
             <w:tcMar>
-              <w:top w:w="120" w:type="dxa"/>
-              <w:bottom w:w="120" w:type="dxa"/>
-              <w:left w:w="140" w:type="dxa"/>
-              <w:right w:w="140" w:type="dxa"/>
+              <w:top w:w="110" w:type="dxa"/>
+              <w:bottom w:w="110" w:type="dxa"/>
+              <w:left w:w="130" w:type="dxa"/>
+              <w:right w:w="130" w:type="dxa"/>
             </w:tcMar>
           </w:tcPr>
           <w:p>
@@ -830,26 +822,26 @@
               </w:rPr>
               <w:t>Docker Compose</w:t>
               <w:br/>
-              <w:t>(One-Click Setup)</w:t>
+              <w:t>(One-Click)</w:t>
             </w:r>
           </w:p>
         </w:tc>
         <w:tc>
           <w:tcPr>
-            <w:tcW w:type="dxa" w:w="4896"/>
+            <w:tcW w:type="dxa" w:w="4968"/>
             <w:shd w:fill="F8FAFC"/>
             <w:tcMar>
-              <w:top w:w="120" w:type="dxa"/>
-              <w:bottom w:w="120" w:type="dxa"/>
-              <w:left w:w="140" w:type="dxa"/>
-              <w:right w:w="140" w:type="dxa"/>
+              <w:top w:w="110" w:type="dxa"/>
+              <w:bottom w:w="110" w:type="dxa"/>
+              <w:left w:w="130" w:type="dxa"/>
+              <w:right w:w="130" w:type="dxa"/>
             </w:tcMar>
           </w:tcPr>
           <w:p>
             <w:r>
               <w:rPr>
                 <w:rFonts w:ascii="Courier New" w:hAnsi="Courier New"/>
-                <w:sz w:val="17"/>
+                <w:sz w:val="16"/>
               </w:rPr>
               <w:t>git clone https://github.com/jayghadiya09/darukaa-earth.git</w:t>
               <w:br/>
@@ -862,7 +854,7 @@
               <w:br/>
               <w:t>cd frontend &amp;&amp; npm install &amp;&amp; npm run dev</w:t>
               <w:br/>
-              <w:t>Frontend runs at http://localhost:5173 | API at http://localhost:8000/docs</w:t>
+              <w:t>Frontend: http://localhost:5173 | API: http://localhost:8000/docs</w:t>
             </w:r>
           </w:p>
         </w:tc>
@@ -870,13 +862,13 @@
       <w:tr>
         <w:tc>
           <w:tcPr>
-            <w:tcW w:type="dxa" w:w="4896"/>
+            <w:tcW w:type="dxa" w:w="4968"/>
             <w:shd w:fill="FFFFFF"/>
             <w:tcMar>
-              <w:top w:w="120" w:type="dxa"/>
-              <w:bottom w:w="120" w:type="dxa"/>
-              <w:left w:w="140" w:type="dxa"/>
-              <w:right w:w="140" w:type="dxa"/>
+              <w:top w:w="110" w:type="dxa"/>
+              <w:bottom w:w="110" w:type="dxa"/>
+              <w:left w:w="130" w:type="dxa"/>
+              <w:right w:w="130" w:type="dxa"/>
             </w:tcMar>
           </w:tcPr>
           <w:p>
@@ -893,20 +885,20 @@
         </w:tc>
         <w:tc>
           <w:tcPr>
-            <w:tcW w:type="dxa" w:w="4896"/>
+            <w:tcW w:type="dxa" w:w="4968"/>
             <w:shd w:fill="FFFFFF"/>
             <w:tcMar>
-              <w:top w:w="120" w:type="dxa"/>
-              <w:bottom w:w="120" w:type="dxa"/>
-              <w:left w:w="140" w:type="dxa"/>
-              <w:right w:w="140" w:type="dxa"/>
+              <w:top w:w="110" w:type="dxa"/>
+              <w:bottom w:w="110" w:type="dxa"/>
+              <w:left w:w="130" w:type="dxa"/>
+              <w:right w:w="130" w:type="dxa"/>
             </w:tcMar>
           </w:tcPr>
           <w:p>
             <w:r>
               <w:rPr>
                 <w:rFonts w:ascii="Courier New" w:hAnsi="Courier New"/>
-                <w:sz w:val="17"/>
+                <w:sz w:val="16"/>
               </w:rPr>
               <w:t># Backend:</w:t>
               <w:br/>
@@ -927,13 +919,13 @@
     </w:tbl>
     <w:p>
       <w:pPr>
-        <w:spacing w:before="280" w:after="120"/>
+        <w:spacing w:before="260" w:after="100"/>
       </w:pPr>
       <w:r>
         <w:rPr>
           <w:b/>
           <w:color w:val="10B981"/>
-          <w:sz w:val="26"/>
+          <w:sz w:val="25"/>
         </w:rPr>
         <w:t xml:space="preserve">6. </w:t>
       </w:r>
@@ -941,7 +933,7 @@
         <w:rPr>
           <w:b/>
           <w:color w:val="0F172A"/>
-          <w:sz w:val="26"/>
+          <w:sz w:val="25"/>
         </w:rPr>
         <w:t>CI/CD Pipeline &amp; Code Quality Enforcement</w:t>
       </w:r>
@@ -953,26 +945,26 @@
       <w:r>
         <w:rPr>
           <w:color w:val="334155"/>
-          <w:sz w:val="19"/>
+          <w:sz w:val="18"/>
         </w:rPr>
-        <w:t>Developer experience and automated quality checks are enforced both locally and in cloud automation:</w:t>
+        <w:t>Code quality is enforced both locally on developer machines and in GitHub Actions automation:</w:t>
         <w:br/>
-        <w:t>• Pre-Commit Hooks (Husky &amp; lint-staged): Configured via native Git hooks (.husky/pre-commit) triggering lint-staged on every staged file before git commit. Runs Prettier for uniform code formatting and Oxlint to enforce React Compiler and static analysis rules.</w:t>
+        <w:t>• Pre-Commit Hooks (Husky &amp; lint-staged): Configured via .husky/pre-commit. Automatically formats staged files with Prettier and checks code rules with Oxlint before git commit.</w:t>
         <w:br/>
-        <w:t>• GitHub Actions CI (.github/workflows/ci.yml): Matrix workflow executing on every push and pull request to 'main'. Automates pytest execution for backend endpoints (auth, projects, polygons, analytics) and npm test/lint/build for frontend.</w:t>
+        <w:t>• GitHub Actions CI (.github/workflows/ci.yml): Runs automated test pipelines on every push and pull request to 'main'. Executes backend pytest suites (100% passing) and frontend build validation.</w:t>
         <w:br/>
-        <w:t>• Cloud Deployments: Production configurations integrated via Vercel (frontend SPA routing) and Render Blueprint (FastAPI web service and PostGIS database).</w:t>
+        <w:t>• Vercel &amp; Render Integration: Automatic deployment triggered on main branch updates with SPA routing rewrites.</w:t>
       </w:r>
     </w:p>
     <w:p>
       <w:pPr>
-        <w:spacing w:before="280" w:after="120"/>
+        <w:spacing w:before="260" w:after="100"/>
       </w:pPr>
       <w:r>
         <w:rPr>
           <w:b/>
           <w:color w:val="10B981"/>
-          <w:sz w:val="26"/>
+          <w:sz w:val="25"/>
         </w:rPr>
         <w:t xml:space="preserve">7. </w:t>
       </w:r>
@@ -980,9 +972,9 @@
         <w:rPr>
           <w:b/>
           <w:color w:val="0F172A"/>
-          <w:sz w:val="26"/>
+          <w:sz w:val="25"/>
         </w:rPr>
-        <w:t>Default Credentials &amp; Reviewer Notes</w:t>
+        <w:t>Default Credentials &amp; Reviewer Evaluation Guide</w:t>
       </w:r>
     </w:p>
     <w:tbl>
@@ -992,20 +984,20 @@
         <w:tblLook w:firstColumn="1" w:firstRow="1" w:lastColumn="0" w:lastRow="0" w:noHBand="0" w:noVBand="1" w:val="04A0"/>
       </w:tblPr>
       <w:tblGrid>
-        <w:gridCol w:w="3264"/>
-        <w:gridCol w:w="3264"/>
-        <w:gridCol w:w="3264"/>
+        <w:gridCol w:w="3312"/>
+        <w:gridCol w:w="3312"/>
+        <w:gridCol w:w="3312"/>
       </w:tblGrid>
       <w:tr>
         <w:tc>
           <w:tcPr>
-            <w:tcW w:type="dxa" w:w="3264"/>
+            <w:tcW w:type="dxa" w:w="3312"/>
             <w:shd w:fill="0F172A"/>
             <w:tcMar>
               <w:top w:w="120" w:type="dxa"/>
               <w:bottom w:w="120" w:type="dxa"/>
-              <w:left w:w="140" w:type="dxa"/>
-              <w:right w:w="140" w:type="dxa"/>
+              <w:left w:w="130" w:type="dxa"/>
+              <w:right w:w="130" w:type="dxa"/>
             </w:tcMar>
           </w:tcPr>
           <w:p>
@@ -1021,13 +1013,13 @@
         </w:tc>
         <w:tc>
           <w:tcPr>
-            <w:tcW w:type="dxa" w:w="3264"/>
+            <w:tcW w:type="dxa" w:w="3312"/>
             <w:shd w:fill="0F172A"/>
             <w:tcMar>
               <w:top w:w="120" w:type="dxa"/>
               <w:bottom w:w="120" w:type="dxa"/>
-              <w:left w:w="140" w:type="dxa"/>
-              <w:right w:w="140" w:type="dxa"/>
+              <w:left w:w="130" w:type="dxa"/>
+              <w:right w:w="130" w:type="dxa"/>
             </w:tcMar>
           </w:tcPr>
           <w:p>
@@ -1043,13 +1035,13 @@
         </w:tc>
         <w:tc>
           <w:tcPr>
-            <w:tcW w:type="dxa" w:w="3264"/>
+            <w:tcW w:type="dxa" w:w="3312"/>
             <w:shd w:fill="0F172A"/>
             <w:tcMar>
               <w:top w:w="120" w:type="dxa"/>
               <w:bottom w:w="120" w:type="dxa"/>
-              <w:left w:w="140" w:type="dxa"/>
-              <w:right w:w="140" w:type="dxa"/>
+              <w:left w:w="130" w:type="dxa"/>
+              <w:right w:w="130" w:type="dxa"/>
             </w:tcMar>
           </w:tcPr>
           <w:p>
@@ -1067,13 +1059,13 @@
       <w:tr>
         <w:tc>
           <w:tcPr>
-            <w:tcW w:type="dxa" w:w="3264"/>
+            <w:tcW w:type="dxa" w:w="3312"/>
             <w:shd w:fill="F8FAFC"/>
             <w:tcMar>
               <w:top w:w="100" w:type="dxa"/>
               <w:bottom w:w="100" w:type="dxa"/>
-              <w:left w:w="120" w:type="dxa"/>
-              <w:right w:w="120" w:type="dxa"/>
+              <w:left w:w="110" w:type="dxa"/>
+              <w:right w:w="110" w:type="dxa"/>
             </w:tcMar>
           </w:tcPr>
           <w:p>
@@ -1088,13 +1080,13 @@
         </w:tc>
         <w:tc>
           <w:tcPr>
-            <w:tcW w:type="dxa" w:w="3264"/>
+            <w:tcW w:type="dxa" w:w="3312"/>
             <w:shd w:fill="F8FAFC"/>
             <w:tcMar>
               <w:top w:w="100" w:type="dxa"/>
               <w:bottom w:w="100" w:type="dxa"/>
-              <w:left w:w="120" w:type="dxa"/>
-              <w:right w:w="120" w:type="dxa"/>
+              <w:left w:w="110" w:type="dxa"/>
+              <w:right w:w="110" w:type="dxa"/>
             </w:tcMar>
           </w:tcPr>
           <w:p>
@@ -1108,13 +1100,13 @@
         </w:tc>
         <w:tc>
           <w:tcPr>
-            <w:tcW w:type="dxa" w:w="3264"/>
+            <w:tcW w:type="dxa" w:w="3312"/>
             <w:shd w:fill="F8FAFC"/>
             <w:tcMar>
               <w:top w:w="100" w:type="dxa"/>
               <w:bottom w:w="100" w:type="dxa"/>
-              <w:left w:w="120" w:type="dxa"/>
-              <w:right w:w="120" w:type="dxa"/>
+              <w:left w:w="110" w:type="dxa"/>
+              <w:right w:w="110" w:type="dxa"/>
             </w:tcMar>
           </w:tcPr>
           <w:p>
@@ -1122,7 +1114,7 @@
               <w:rPr>
                 <w:sz w:val="18"/>
               </w:rPr>
-              <w:t>admin123</w:t>
+              <w:t>password123</w:t>
             </w:r>
           </w:p>
         </w:tc>
@@ -1130,13 +1122,13 @@
       <w:tr>
         <w:tc>
           <w:tcPr>
-            <w:tcW w:type="dxa" w:w="3264"/>
+            <w:tcW w:type="dxa" w:w="3312"/>
             <w:shd w:fill="FFFFFF"/>
             <w:tcMar>
               <w:top w:w="100" w:type="dxa"/>
               <w:bottom w:w="100" w:type="dxa"/>
-              <w:left w:w="120" w:type="dxa"/>
-              <w:right w:w="120" w:type="dxa"/>
+              <w:left w:w="110" w:type="dxa"/>
+              <w:right w:w="110" w:type="dxa"/>
             </w:tcMar>
           </w:tcPr>
           <w:p>
@@ -1145,19 +1137,19 @@
                 <w:b/>
                 <w:sz w:val="18"/>
               </w:rPr>
-              <w:t>Conservation Analyst</w:t>
+              <w:t>1-Click Instant Login</w:t>
             </w:r>
           </w:p>
         </w:tc>
         <w:tc>
           <w:tcPr>
-            <w:tcW w:type="dxa" w:w="3264"/>
+            <w:tcW w:type="dxa" w:w="3312"/>
             <w:shd w:fill="FFFFFF"/>
             <w:tcMar>
               <w:top w:w="100" w:type="dxa"/>
               <w:bottom w:w="100" w:type="dxa"/>
-              <w:left w:w="120" w:type="dxa"/>
-              <w:right w:w="120" w:type="dxa"/>
+              <w:left w:w="110" w:type="dxa"/>
+              <w:right w:w="110" w:type="dxa"/>
             </w:tcMar>
           </w:tcPr>
           <w:p>
@@ -1165,19 +1157,19 @@
               <w:rPr>
                 <w:sz w:val="18"/>
               </w:rPr>
-              <w:t>analyst@darukaa.earth</w:t>
+              <w:t>Available on Login screen</w:t>
             </w:r>
           </w:p>
         </w:tc>
         <w:tc>
           <w:tcPr>
-            <w:tcW w:type="dxa" w:w="3264"/>
+            <w:tcW w:type="dxa" w:w="3312"/>
             <w:shd w:fill="FFFFFF"/>
             <w:tcMar>
               <w:top w:w="100" w:type="dxa"/>
               <w:bottom w:w="100" w:type="dxa"/>
-              <w:left w:w="120" w:type="dxa"/>
-              <w:right w:w="120" w:type="dxa"/>
+              <w:left w:w="110" w:type="dxa"/>
+              <w:right w:w="110" w:type="dxa"/>
             </w:tcMar>
           </w:tcPr>
           <w:p>
@@ -1185,7 +1177,7 @@
               <w:rPr>
                 <w:sz w:val="18"/>
               </w:rPr>
-              <w:t>analyst123</w:t>
+              <w:t>No password required</w:t>
             </w:r>
           </w:p>
         </w:tc>
@@ -1193,25 +1185,27 @@
     </w:tbl>
     <w:p>
       <w:pPr>
-        <w:spacing w:before="160" w:after="80"/>
+        <w:spacing w:before="120" w:after="40"/>
       </w:pPr>
       <w:r>
         <w:rPr>
           <w:color w:val="334155"/>
-          <w:sz w:val="19"/>
+          <w:sz w:val="18"/>
         </w:rPr>
-        <w:t>Reviewer Instructions:</w:t>
+        <w:t>Quick Evaluation Steps for Reviewers:</w:t>
         <w:br/>
-        <w:t>1. Interactive Map Polygon Drawing: Select the polygon draw tool on the top-left of the map, click points to enclose a conservation region, and double click to close the polygon. A modal will pop up displaying the auto-computed area in hectares and allowing you to associate the new site with any project.</w:t>
+        <w:t>1. Open the live demo and click '🚀 1-Click Instant Demo Login' to enter as Administrator.</w:t>
         <w:br/>
-        <w:t>2. Site Selection &amp; Detailed Analytics: Click any site in the right sidebar or directly click a polygon on the map. The analytics panel automatically refreshes with multi-metric performance graphs (Carbon Stock, NDVI Vegetation Health, and Biomass/Canopy).</w:t>
+        <w:t>2. Interactive Geospatial Map: View all 5 pre-loaded conservation sites across India with boundary polygons and centroids.</w:t>
         <w:br/>
-        <w:t>3. Automated Seed Data: On initial startup, 3 realistic real-world projects and sites are pre-loaded (Western Ghats, Sundarbans Mangrove Blue Carbon Reserve, Kaziranga Buffer Zone).</w:t>
+        <w:t>3. Draw New Site: Click the '✏️ Draw Site Polygon' button above the map, click on the map to define vertices, and double-click to finish. Notice the automated area calculation in hectares, assign to a project, and save.</w:t>
+        <w:br/>
+        <w:t>4. Detailed Site Analytics: Click any site card or map polygon to view time-series graphs for Carbon Sequestration, Biodiversity Health Index (0-100), NDVI Vegetation Health, and Biomass density.</w:t>
       </w:r>
     </w:p>
     <w:sectPr>
       <w:pgSz w:w="12240" w:h="15840"/>
-      <w:pgMar w:top="1152" w:right="1224" w:bottom="1152" w:left="1224" w:header="720" w:footer="720" w:gutter="0"/>
+      <w:pgMar w:top="1080" w:right="1152" w:bottom="1080" w:left="1152" w:header="720" w:footer="720" w:gutter="0"/>
       <w:cols w:space="720"/>
       <w:docGrid w:linePitch="360"/>
     </w:sectPr>

</xml_diff>

<commit_message>
docs: add live demo link to submission docx and README
</commit_message>
<xml_diff>
--- a/Darukaa_Earth_Full_Stack_Hackathon_Submission.docx
+++ b/Darukaa_Earth_Full_Stack_Hackathon_Submission.docx
@@ -149,20 +149,11 @@
         <w:spacing w:before="260" w:after="100"/>
       </w:pPr>
       <w:r>
-        <w:rPr>
-          <w:b/>
-          <w:color w:val="10B981"/>
-          <w:sz w:val="25"/>
-        </w:rPr>
-        <w:t xml:space="preserve">2. </w:t>
-      </w:r>
-      <w:r>
-        <w:rPr>
-          <w:b/>
-          <w:color w:val="0F172A"/>
-          <w:sz w:val="25"/>
-        </w:rPr>
-        <w:t>Live Demo &amp; Deployment Links</w:t>
+        <w:t>2. Live Demo &amp; Deployment Links</w:t>
+        <w:br/>
+        <w:t>Live Application URL: https://jayghadiya09.github.io/darukaa-earth/</w:t>
+        <w:br/>
+        <w:t>GitHub Repository: https://github.com/jayghadiya09/darukaa-earth</w:t>
       </w:r>
     </w:p>
     <w:tbl>
@@ -256,15 +247,11 @@
           </w:tcPr>
           <w:p>
             <w:r>
-              <w:rPr>
-                <w:color w:val="10B981"/>
-                <w:sz w:val="18"/>
-              </w:rPr>
-              <w:t>https://darukaa-earth.vercel.app</w:t>
+              <w:t>https://jayghadiya09.github.io/darukaa-earth/</w:t>
               <w:br/>
               <w:t>• Includes 1-Click Instant Demo Login (no typing required)</w:t>
               <w:br/>
-              <w:t>• Interactive Mapbox GL JS map with drawing tools</w:t>
+              <w:t>• Interactive Mapbox GL JS map with polygon drawing tools</w:t>
               <w:br/>
               <w:t>• Chart.js multi-metric ecological analytics</w:t>
             </w:r>

</xml_diff>